<commit_message>
Update project selection criteria and failure rate thresholds in documentation and scripts
</commit_message>
<xml_diff>
--- a/docs/reports/MSE_Thesis_Proposal.docx
+++ b/docs/reports/MSE_Thesis_Proposal.docx
@@ -1,6 +1,6 @@
 
 <file path=word/document.xml><?xml version="1.0" encoding="utf-8"?>
-<w:document xmlns:wpc="http://schemas.microsoft.com/office/word/2010/wordprocessingCanvas" xmlns:cx="http://schemas.microsoft.com/office/drawing/2014/chartex" xmlns:cx1="http://schemas.microsoft.com/office/drawing/2015/9/8/chartex" xmlns:cx2="http://schemas.microsoft.com/office/drawing/2015/10/21/chartex" xmlns:cx3="http://schemas.microsoft.com/office/drawing/2016/5/9/chartex" xmlns:cx4="http://schemas.microsoft.com/office/drawing/2016/5/10/chartex" xmlns:cx5="http://schemas.microsoft.com/office/drawing/2016/5/11/chartex" xmlns:cx6="http://schemas.microsoft.com/office/drawing/2016/5/12/chartex" xmlns:cx7="http://schemas.microsoft.com/office/drawing/2016/5/13/chartex" xmlns:cx8="http://schemas.microsoft.com/office/drawing/2016/5/14/chartex" xmlns:mc="http://schemas.openxmlformats.org/markup-compatibility/2006" xmlns:aink="http://schemas.microsoft.com/office/drawing/2016/ink" xmlns:am3d="http://schemas.microsoft.com/office/drawing/2017/model3d" xmlns:o="urn:schemas-microsoft-com:office:office" xmlns:oel="http://schemas.microsoft.com/office/2019/extlst" xmlns:r="http://schemas.openxmlformats.org/officeDocument/2006/relationships" xmlns:m="http://schemas.openxmlformats.org/officeDocument/2006/math" xmlns:v="urn:schemas-microsoft-com:vml" xmlns:wp14="http://schemas.microsoft.com/office/word/2010/wordprocessingDrawing" xmlns:wp="http://schemas.openxmlformats.org/drawingml/2006/wordprocessingDrawing" xmlns:w10="urn:schemas-microsoft-com:office:word" xmlns:w="http://schemas.openxmlformats.org/wordprocessingml/2006/main" xmlns:w14="http://schemas.microsoft.com/office/word/2010/wordml" xmlns:w15="http://schemas.microsoft.com/office/word/2012/wordml" xmlns:w16cex="http://schemas.microsoft.com/office/word/2018/wordml/cex" xmlns:w16cid="http://schemas.microsoft.com/office/word/2016/wordml/cid" xmlns:w16="http://schemas.microsoft.com/office/word/2018/wordml" xmlns:w16du="http://schemas.microsoft.com/office/word/2023/wordml/word16du" xmlns:w16sdtdh="http://schemas.microsoft.com/office/word/2020/wordml/sdtdatahash" xmlns:w16sdtfl="http://schemas.microsoft.com/office/word/2024/wordml/sdtformatlock" xmlns:w16se="http://schemas.microsoft.com/office/word/2015/wordml/symex" xmlns:wpg="http://schemas.microsoft.com/office/word/2010/wordprocessingGroup" xmlns:wpi="http://schemas.microsoft.com/office/word/2010/wordprocessingInk" xmlns:wne="http://schemas.microsoft.com/office/word/2006/wordml" xmlns:wps="http://schemas.microsoft.com/office/word/2010/wordprocessingShape" mc:Ignorable="w14 w15 w16se w16cid w16 w16cex w16sdtdh w16sdtfl w16du wp14">
+<w:document xmlns:wpc="http://schemas.microsoft.com/office/word/2010/wordprocessingCanvas" xmlns:cx="http://schemas.microsoft.com/office/drawing/2014/chartex" xmlns:cx1="http://schemas.microsoft.com/office/drawing/2015/9/8/chartex" xmlns:cx2="http://schemas.microsoft.com/office/drawing/2015/10/21/chartex" xmlns:cx3="http://schemas.microsoft.com/office/drawing/2016/5/9/chartex" xmlns:cx4="http://schemas.microsoft.com/office/drawing/2016/5/10/chartex" xmlns:cx5="http://schemas.microsoft.com/office/drawing/2016/5/11/chartex" xmlns:cx6="http://schemas.microsoft.com/office/drawing/2016/5/12/chartex" xmlns:cx7="http://schemas.microsoft.com/office/drawing/2016/5/13/chartex" xmlns:cx8="http://schemas.microsoft.com/office/drawing/2016/5/14/chartex" xmlns:mc="http://schemas.openxmlformats.org/markup-compatibility/2006" xmlns:aink="http://schemas.microsoft.com/office/drawing/2016/ink" xmlns:am3d="http://schemas.microsoft.com/office/drawing/2017/model3d" xmlns:o="urn:schemas-microsoft-com:office:office" xmlns:oel="http://schemas.microsoft.com/office/2019/extlst" xmlns:r="http://schemas.openxmlformats.org/officeDocument/2006/relationships" xmlns:m="http://schemas.openxmlformats.org/officeDocument/2006/math" xmlns:v="urn:schemas-microsoft-com:vml" xmlns:wp14="http://schemas.microsoft.com/office/word/2010/wordprocessingDrawing" xmlns:wp="http://schemas.openxmlformats.org/drawingml/2006/wordprocessingDrawing" xmlns:w10="urn:schemas-microsoft-com:office:word" xmlns:w="http://schemas.openxmlformats.org/wordprocessingml/2006/main" xmlns:w14="http://schemas.microsoft.com/office/word/2010/wordml" xmlns:w15="http://schemas.microsoft.com/office/word/2012/wordml" xmlns:w16cex="http://schemas.microsoft.com/office/word/2018/wordml/cex" xmlns:w16cid="http://schemas.microsoft.com/office/word/2016/wordml/cid" xmlns:w16="http://schemas.microsoft.com/office/word/2018/wordml" xmlns:w16du="http://schemas.microsoft.com/office/word/2023/wordml/word16du" xmlns:w16sdtdh="http://schemas.microsoft.com/office/word/2020/wordml/sdtdatahash" xmlns:w16se="http://schemas.microsoft.com/office/word/2015/wordml/symex" xmlns:wpg="http://schemas.microsoft.com/office/word/2010/wordprocessingGroup" xmlns:wpi="http://schemas.microsoft.com/office/word/2010/wordprocessingInk" xmlns:wne="http://schemas.microsoft.com/office/word/2006/wordml" xmlns:wps="http://schemas.microsoft.com/office/word/2010/wordprocessingShape" mc:Ignorable="w14 w15 w16se w16cid w16 w16cex w16sdtdh w16du wp14">
   <w:body>
     <w:p>
       <w:pPr>
@@ -120,12 +120,6 @@
         <w:gridCol w:w="6626"/>
       </w:tblGrid>
       <w:tr>
-        <w:tblPrEx>
-          <w:tblCellMar>
-            <w:top w:w="0" w:type="dxa"/>
-            <w:bottom w:w="0" w:type="dxa"/>
-          </w:tblCellMar>
-        </w:tblPrEx>
         <w:tc>
           <w:tcPr>
             <w:tcW w:w="2400" w:type="dxa"/>
@@ -182,12 +176,6 @@
         </w:tc>
       </w:tr>
       <w:tr>
-        <w:tblPrEx>
-          <w:tblCellMar>
-            <w:top w:w="0" w:type="dxa"/>
-            <w:bottom w:w="0" w:type="dxa"/>
-          </w:tblCellMar>
-        </w:tblPrEx>
         <w:tc>
           <w:tcPr>
             <w:tcW w:w="2400" w:type="dxa"/>
@@ -244,12 +232,6 @@
         </w:tc>
       </w:tr>
       <w:tr>
-        <w:tblPrEx>
-          <w:tblCellMar>
-            <w:top w:w="0" w:type="dxa"/>
-            <w:bottom w:w="0" w:type="dxa"/>
-          </w:tblCellMar>
-        </w:tblPrEx>
         <w:tc>
           <w:tcPr>
             <w:tcW w:w="2400" w:type="dxa"/>
@@ -306,12 +288,6 @@
         </w:tc>
       </w:tr>
       <w:tr>
-        <w:tblPrEx>
-          <w:tblCellMar>
-            <w:top w:w="0" w:type="dxa"/>
-            <w:bottom w:w="0" w:type="dxa"/>
-          </w:tblCellMar>
-        </w:tblPrEx>
         <w:tc>
           <w:tcPr>
             <w:tcW w:w="2400" w:type="dxa"/>
@@ -368,12 +344,6 @@
         </w:tc>
       </w:tr>
       <w:tr>
-        <w:tblPrEx>
-          <w:tblCellMar>
-            <w:top w:w="0" w:type="dxa"/>
-            <w:bottom w:w="0" w:type="dxa"/>
-          </w:tblCellMar>
-        </w:tblPrEx>
         <w:tc>
           <w:tcPr>
             <w:tcW w:w="2400" w:type="dxa"/>
@@ -430,12 +400,6 @@
         </w:tc>
       </w:tr>
       <w:tr>
-        <w:tblPrEx>
-          <w:tblCellMar>
-            <w:top w:w="0" w:type="dxa"/>
-            <w:bottom w:w="0" w:type="dxa"/>
-          </w:tblCellMar>
-        </w:tblPrEx>
         <w:tc>
           <w:tcPr>
             <w:tcW w:w="2400" w:type="dxa"/>
@@ -550,12 +514,6 @@
         <w:gridCol w:w="7026"/>
       </w:tblGrid>
       <w:tr>
-        <w:tblPrEx>
-          <w:tblCellMar>
-            <w:top w:w="0" w:type="dxa"/>
-            <w:bottom w:w="0" w:type="dxa"/>
-          </w:tblCellMar>
-        </w:tblPrEx>
         <w:trPr>
           <w:tblHeader/>
         </w:trPr>
@@ -619,12 +577,6 @@
         </w:tc>
       </w:tr>
       <w:tr>
-        <w:tblPrEx>
-          <w:tblCellMar>
-            <w:top w:w="0" w:type="dxa"/>
-            <w:bottom w:w="0" w:type="dxa"/>
-          </w:tblCellMar>
-        </w:tblPrEx>
         <w:tc>
           <w:tcPr>
             <w:tcW w:w="2000" w:type="dxa"/>
@@ -681,12 +633,6 @@
         </w:tc>
       </w:tr>
       <w:tr>
-        <w:tblPrEx>
-          <w:tblCellMar>
-            <w:top w:w="0" w:type="dxa"/>
-            <w:bottom w:w="0" w:type="dxa"/>
-          </w:tblCellMar>
-        </w:tblPrEx>
         <w:tc>
           <w:tcPr>
             <w:tcW w:w="2000" w:type="dxa"/>
@@ -743,12 +689,6 @@
         </w:tc>
       </w:tr>
       <w:tr>
-        <w:tblPrEx>
-          <w:tblCellMar>
-            <w:top w:w="0" w:type="dxa"/>
-            <w:bottom w:w="0" w:type="dxa"/>
-          </w:tblCellMar>
-        </w:tblPrEx>
         <w:tc>
           <w:tcPr>
             <w:tcW w:w="2000" w:type="dxa"/>
@@ -805,12 +745,6 @@
         </w:tc>
       </w:tr>
       <w:tr>
-        <w:tblPrEx>
-          <w:tblCellMar>
-            <w:top w:w="0" w:type="dxa"/>
-            <w:bottom w:w="0" w:type="dxa"/>
-          </w:tblCellMar>
-        </w:tblPrEx>
         <w:tc>
           <w:tcPr>
             <w:tcW w:w="2000" w:type="dxa"/>
@@ -1158,12 +1092,6 @@
         <w:gridCol w:w="3626"/>
       </w:tblGrid>
       <w:tr>
-        <w:tblPrEx>
-          <w:tblCellMar>
-            <w:top w:w="0" w:type="dxa"/>
-            <w:bottom w:w="0" w:type="dxa"/>
-          </w:tblCellMar>
-        </w:tblPrEx>
         <w:trPr>
           <w:tblHeader/>
         </w:trPr>
@@ -1256,12 +1184,6 @@
         </w:tc>
       </w:tr>
       <w:tr>
-        <w:tblPrEx>
-          <w:tblCellMar>
-            <w:top w:w="0" w:type="dxa"/>
-            <w:bottom w:w="0" w:type="dxa"/>
-          </w:tblCellMar>
-        </w:tblPrEx>
         <w:tc>
           <w:tcPr>
             <w:tcW w:w="1800" w:type="dxa"/>
@@ -1345,12 +1267,6 @@
         </w:tc>
       </w:tr>
       <w:tr>
-        <w:tblPrEx>
-          <w:tblCellMar>
-            <w:top w:w="0" w:type="dxa"/>
-            <w:bottom w:w="0" w:type="dxa"/>
-          </w:tblCellMar>
-        </w:tblPrEx>
         <w:tc>
           <w:tcPr>
             <w:tcW w:w="1800" w:type="dxa"/>
@@ -1434,12 +1350,6 @@
         </w:tc>
       </w:tr>
       <w:tr>
-        <w:tblPrEx>
-          <w:tblCellMar>
-            <w:top w:w="0" w:type="dxa"/>
-            <w:bottom w:w="0" w:type="dxa"/>
-          </w:tblCellMar>
-        </w:tblPrEx>
         <w:tc>
           <w:tcPr>
             <w:tcW w:w="1800" w:type="dxa"/>
@@ -1523,12 +1433,6 @@
         </w:tc>
       </w:tr>
       <w:tr>
-        <w:tblPrEx>
-          <w:tblCellMar>
-            <w:top w:w="0" w:type="dxa"/>
-            <w:bottom w:w="0" w:type="dxa"/>
-          </w:tblCellMar>
-        </w:tblPrEx>
         <w:tc>
           <w:tcPr>
             <w:tcW w:w="1800" w:type="dxa"/>
@@ -1612,12 +1516,6 @@
         </w:tc>
       </w:tr>
       <w:tr>
-        <w:tblPrEx>
-          <w:tblCellMar>
-            <w:top w:w="0" w:type="dxa"/>
-            <w:bottom w:w="0" w:type="dxa"/>
-          </w:tblCellMar>
-        </w:tblPrEx>
         <w:tc>
           <w:tcPr>
             <w:tcW w:w="1800" w:type="dxa"/>
@@ -1893,12 +1791,6 @@
         <w:gridCol w:w="3226"/>
       </w:tblGrid>
       <w:tr>
-        <w:tblPrEx>
-          <w:tblCellMar>
-            <w:top w:w="0" w:type="dxa"/>
-            <w:bottom w:w="0" w:type="dxa"/>
-          </w:tblCellMar>
-        </w:tblPrEx>
         <w:trPr>
           <w:tblHeader/>
         </w:trPr>
@@ -1991,12 +1883,6 @@
         </w:tc>
       </w:tr>
       <w:tr>
-        <w:tblPrEx>
-          <w:tblCellMar>
-            <w:top w:w="0" w:type="dxa"/>
-            <w:bottom w:w="0" w:type="dxa"/>
-          </w:tblCellMar>
-        </w:tblPrEx>
         <w:tc>
           <w:tcPr>
             <w:tcW w:w="2200" w:type="dxa"/>
@@ -2080,12 +1966,6 @@
         </w:tc>
       </w:tr>
       <w:tr>
-        <w:tblPrEx>
-          <w:tblCellMar>
-            <w:top w:w="0" w:type="dxa"/>
-            <w:bottom w:w="0" w:type="dxa"/>
-          </w:tblCellMar>
-        </w:tblPrEx>
         <w:tc>
           <w:tcPr>
             <w:tcW w:w="2200" w:type="dxa"/>
@@ -2169,12 +2049,6 @@
         </w:tc>
       </w:tr>
       <w:tr>
-        <w:tblPrEx>
-          <w:tblCellMar>
-            <w:top w:w="0" w:type="dxa"/>
-            <w:bottom w:w="0" w:type="dxa"/>
-          </w:tblCellMar>
-        </w:tblPrEx>
         <w:tc>
           <w:tcPr>
             <w:tcW w:w="2200" w:type="dxa"/>
@@ -2258,12 +2132,6 @@
         </w:tc>
       </w:tr>
       <w:tr>
-        <w:tblPrEx>
-          <w:tblCellMar>
-            <w:top w:w="0" w:type="dxa"/>
-            <w:bottom w:w="0" w:type="dxa"/>
-          </w:tblCellMar>
-        </w:tblPrEx>
         <w:tc>
           <w:tcPr>
             <w:tcW w:w="2200" w:type="dxa"/>
@@ -2347,12 +2215,6 @@
         </w:tc>
       </w:tr>
       <w:tr>
-        <w:tblPrEx>
-          <w:tblCellMar>
-            <w:top w:w="0" w:type="dxa"/>
-            <w:bottom w:w="0" w:type="dxa"/>
-          </w:tblCellMar>
-        </w:tblPrEx>
         <w:tc>
           <w:tcPr>
             <w:tcW w:w="2200" w:type="dxa"/>
@@ -2436,12 +2298,6 @@
         </w:tc>
       </w:tr>
       <w:tr>
-        <w:tblPrEx>
-          <w:tblCellMar>
-            <w:top w:w="0" w:type="dxa"/>
-            <w:bottom w:w="0" w:type="dxa"/>
-          </w:tblCellMar>
-        </w:tblPrEx>
         <w:tc>
           <w:tcPr>
             <w:tcW w:w="2200" w:type="dxa"/>
@@ -2525,12 +2381,6 @@
         </w:tc>
       </w:tr>
       <w:tr>
-        <w:tblPrEx>
-          <w:tblCellMar>
-            <w:top w:w="0" w:type="dxa"/>
-            <w:bottom w:w="0" w:type="dxa"/>
-          </w:tblCellMar>
-        </w:tblPrEx>
         <w:tc>
           <w:tcPr>
             <w:tcW w:w="2200" w:type="dxa"/>
@@ -2614,12 +2464,6 @@
         </w:tc>
       </w:tr>
       <w:tr>
-        <w:tblPrEx>
-          <w:tblCellMar>
-            <w:top w:w="0" w:type="dxa"/>
-            <w:bottom w:w="0" w:type="dxa"/>
-          </w:tblCellMar>
-        </w:tblPrEx>
         <w:tc>
           <w:tcPr>
             <w:tcW w:w="2200" w:type="dxa"/>
@@ -2827,10 +2671,50 @@
     </w:p>
     <w:p>
       <w:pPr>
+        <w:pStyle w:val="font-claude-response-body"/>
+      </w:pPr>
+      <w:r>
+        <w:t xml:space="preserve">This phase establishes the research foundation. Activities include: systematic review of test prioritization literature with particular focus on ROCKET [7], SELECT [8], Bertolino et al. [4], and Elsner et al. [3]; </w:t>
+      </w:r>
+      <w:r>
+        <w:t xml:space="preserve">collection and verification of </w:t>
+      </w:r>
+      <w:r>
+        <w:rPr>
+          <w:rStyle w:val="Strong"/>
+        </w:rPr>
+        <w:t>five Java projects</w:t>
+      </w:r>
+      <w:r>
+        <w:t xml:space="preserve"> from the RTPTorrent benchmark</w:t>
+      </w:r>
+      <w:r>
+        <w:t xml:space="preserve"> </w:t>
+      </w:r>
+      <w:r>
+        <w:t xml:space="preserve">(Mattis et al., 2020) satisfying the dataset selection criteria defined in Section 3.3; implementation of the git history feature extraction pipeline; and construction of the initial feature matrix in Parquet format. Deliverables: annotated bibliography, </w:t>
+      </w:r>
+      <w:r>
+        <w:t>verified dataset (confirmed project selection: 5 projects, build count, failure rate ≥1%)</w:t>
+      </w:r>
+      <w:r>
+        <w:t>, feature extraction script, SRS document.</w:t>
+      </w:r>
+    </w:p>
+    <w:p>
+      <w:pPr>
+        <w:pStyle w:val="Heading3"/>
+      </w:pPr>
+      <w:r>
+        <w:t>Phase 2 — Model Training and Baseline Evaluation (Month 2)</w:t>
+      </w:r>
+    </w:p>
+    <w:p>
+      <w:pPr>
         <w:spacing w:after="120"/>
       </w:pPr>
       <w:r>
-        <w:t>This phase establishes the research foundation. Activities include: systematic review of test prioritization literature with particular focus on ROCKET [7], SELECT [8], Bertolino et al. [4], and Elsner et al. [3]; collection and verification of at least two Java repositories from the RTPTorrent benchmark (Mattis et al., 2020) satisfying the dataset selection criteria defined in Section 3.3; implementation of the git history feature extraction pipeline; and construction of the initial feature matrix in Parquet format. Deliverables: annotated bibliography, verified dataset (confirmed repository + commit count + failure rate), feature extraction script, SRS document.</w:t>
+        <w:t>This phase addresses RQ1. Activities include: implementation of time-aware train/test split to prevent data leakage; training of XGBoost and LightGBM models across the feature groups defined in Section 5.5; hyperparameter tuning via cross-validation; baseline comparison against random ordering, alphabetical ordering, Most Recently Failed (MRF) heuristic, and the Elsner et al. (2021) VCS-only baseline; and MLflow experiment tracking for full reproducibility. Deliverables: trained models registered in MLflow, APFD evaluation report with baseline comparison.</w:t>
       </w:r>
     </w:p>
     <w:p>
@@ -2838,7 +2722,7 @@
         <w:pStyle w:val="Heading3"/>
       </w:pPr>
       <w:r>
-        <w:t>Phase 2 — Model Training and Baseline Evaluation (Month 2)</w:t>
+        <w:t>Phase 3 — CI Integration and Early Exit Implementation (Month 3)</w:t>
       </w:r>
     </w:p>
     <w:p>
@@ -2846,7 +2730,7 @@
         <w:spacing w:after="120"/>
       </w:pPr>
       <w:r>
-        <w:t>This phase addresses RQ1. Activities include: implementation of time-aware train/test split to prevent data leakage; training of XGBoost and LightGBM models across the feature groups defined in Section 5.5; hyperparameter tuning via cross-validation; baseline comparison against random ordering, alphabetical ordering, Most Recently Failed (MRF) heuristic, and the Elsner et al. (2021) VCS-only baseline; and MLflow experiment tracking for full reproducibility. Deliverables: trained models registered in MLflow, APFD evaluation report with baseline comparison.</w:t>
+        <w:t>This phase addresses RQ2a and RQ2b. Activities include: implementation of the FastAPI model serving endpoint; development of the GitHub Actions custom action (CI plugin); integration of the confidence-based early exit mechanism with configurable threshold; end-to-end demonstration on the primary RTPTorrent project; and documentation of the plugin API. Deliverables: working GitHub Actions plugin, end-to-end demo with measured time reduction, trade-off curve across confidence thresholds [0.5, 0.6, 0.7, 0.8, 0.9].</w:t>
       </w:r>
     </w:p>
     <w:p>
@@ -2854,7 +2738,38 @@
         <w:pStyle w:val="Heading3"/>
       </w:pPr>
       <w:r>
-        <w:t>Phase 3 — CI Integration and Early Exit Implementation (Month 3)</w:t>
+        <w:t>Phase 4 — Drift Detection, Dashboard, Evaluation, and Thesis Writing (Month 4)</w:t>
+      </w:r>
+    </w:p>
+    <w:p>
+      <w:pPr>
+        <w:pStyle w:val="font-claude-response-body"/>
+      </w:pPr>
+      <w:r>
+        <w:t xml:space="preserve">This phase addresses RQ3 and consolidates all evaluation. Activities include: implementation of PSI-based drift detection and automatic retrain trigger; development of the ReactJS dashboard for monitoring; </w:t>
+      </w:r>
+      <w:r>
+        <w:t xml:space="preserve">full system evaluation across </w:t>
+      </w:r>
+      <w:r>
+        <w:rPr>
+          <w:rStyle w:val="Strong"/>
+        </w:rPr>
+        <w:t>all five</w:t>
+      </w:r>
+      <w:r>
+        <w:t xml:space="preserve"> RTPTorrent projects</w:t>
+      </w:r>
+      <w:r>
+        <w:t>; statistical analysis of results; and thesis write-up. Deliverables: complete system with drift detection, evaluation report across both repositories, ReactJS dashboard, thesis draft.</w:t>
+      </w:r>
+    </w:p>
+    <w:p>
+      <w:pPr>
+        <w:pStyle w:val="Heading2"/>
+      </w:pPr>
+      <w:r>
+        <w:t>3.2. Expected Schedule (Preliminary)</w:t>
       </w:r>
     </w:p>
     <w:p>
@@ -2862,38 +2777,7 @@
         <w:spacing w:after="120"/>
       </w:pPr>
       <w:r>
-        <w:t>This phase addresses RQ2a and RQ2b. Activities include: implementation of the FastAPI model serving endpoint; development of the GitHub Actions custom action (CI plugin); integration of the confidence-based early exit mechanism with configurable threshold; end-to-end demonstration on the primary RTPTorrent project; and documentation of the plugin API. Deliverables: working GitHub Actions plugin, end-to-end demo with measured time reduction, trade-off curve across confidence thresholds [0.5, 0.6, 0.7, 0.8, 0.9].</w:t>
-      </w:r>
-    </w:p>
-    <w:p>
-      <w:pPr>
-        <w:pStyle w:val="Heading3"/>
-      </w:pPr>
-      <w:r>
-        <w:t>Phase 4 — Drift Detection, Dashboard, Evaluation, and Thesis Writing (Month 4)</w:t>
-      </w:r>
-    </w:p>
-    <w:p>
-      <w:pPr>
-        <w:spacing w:after="120"/>
-      </w:pPr>
-      <w:r>
-        <w:t>This phase addresses RQ3 and consolidates all evaluation. Activities include: implementation of PSI-based drift detection and automatic retrain trigger; development of the ReactJS dashboard for monitoring; full system evaluation on the second RTPTorrent repository; statistical analysis of results; and thesis write-up. Deliverables: complete system with drift detection, evaluation report across both repositories, ReactJS dashboard, thesis draft.</w:t>
-      </w:r>
-    </w:p>
-    <w:p>
-      <w:pPr>
-        <w:pStyle w:val="Heading2"/>
-      </w:pPr>
-      <w:r>
-        <w:t>3.2. Expected Schedule (Preliminary)</w:t>
-      </w:r>
-    </w:p>
-    <w:p>
-      <w:pPr>
-        <w:spacing w:after="120"/>
-      </w:pPr>
-      <w:r>
+        <w:lastRenderedPageBreak/>
         <w:t>The following Gantt chart presents the planned schedule across the four-month timeline (16 weeks). Critical path items are marked with an asterisk (*).</w:t>
       </w:r>
     </w:p>
@@ -2935,12 +2819,6 @@
         <w:gridCol w:w="720"/>
       </w:tblGrid>
       <w:tr>
-        <w:tblPrEx>
-          <w:tblCellMar>
-            <w:top w:w="0" w:type="dxa"/>
-            <w:bottom w:w="0" w:type="dxa"/>
-          </w:tblCellMar>
-        </w:tblPrEx>
         <w:trPr>
           <w:tblHeader/>
         </w:trPr>
@@ -2969,7 +2847,6 @@
                 <w:bCs/>
                 <w:color w:val="FFFFFF"/>
               </w:rPr>
-              <w:lastRenderedPageBreak/>
               <w:t>Task / Week</w:t>
             </w:r>
           </w:p>
@@ -3440,12 +3317,6 @@
         </w:tc>
       </w:tr>
       <w:tr>
-        <w:tblPrEx>
-          <w:tblCellMar>
-            <w:top w:w="0" w:type="dxa"/>
-            <w:bottom w:w="0" w:type="dxa"/>
-          </w:tblCellMar>
-        </w:tblPrEx>
         <w:tc>
           <w:tcPr>
             <w:tcW w:w="1373" w:type="dxa"/>
@@ -3809,12 +3680,6 @@
         </w:tc>
       </w:tr>
       <w:tr>
-        <w:tblPrEx>
-          <w:tblCellMar>
-            <w:top w:w="0" w:type="dxa"/>
-            <w:bottom w:w="0" w:type="dxa"/>
-          </w:tblCellMar>
-        </w:tblPrEx>
         <w:tc>
           <w:tcPr>
             <w:tcW w:w="1373" w:type="dxa"/>
@@ -4185,12 +4050,6 @@
         </w:tc>
       </w:tr>
       <w:tr>
-        <w:tblPrEx>
-          <w:tblCellMar>
-            <w:top w:w="0" w:type="dxa"/>
-            <w:bottom w:w="0" w:type="dxa"/>
-          </w:tblCellMar>
-        </w:tblPrEx>
         <w:tc>
           <w:tcPr>
             <w:tcW w:w="1373" w:type="dxa"/>
@@ -4561,12 +4420,6 @@
         </w:tc>
       </w:tr>
       <w:tr>
-        <w:tblPrEx>
-          <w:tblCellMar>
-            <w:top w:w="0" w:type="dxa"/>
-            <w:bottom w:w="0" w:type="dxa"/>
-          </w:tblCellMar>
-        </w:tblPrEx>
         <w:tc>
           <w:tcPr>
             <w:tcW w:w="1373" w:type="dxa"/>
@@ -4944,12 +4797,6 @@
         </w:tc>
       </w:tr>
       <w:tr>
-        <w:tblPrEx>
-          <w:tblCellMar>
-            <w:top w:w="0" w:type="dxa"/>
-            <w:bottom w:w="0" w:type="dxa"/>
-          </w:tblCellMar>
-        </w:tblPrEx>
         <w:tc>
           <w:tcPr>
             <w:tcW w:w="1373" w:type="dxa"/>
@@ -5327,12 +5174,6 @@
         </w:tc>
       </w:tr>
       <w:tr>
-        <w:tblPrEx>
-          <w:tblCellMar>
-            <w:top w:w="0" w:type="dxa"/>
-            <w:bottom w:w="0" w:type="dxa"/>
-          </w:tblCellMar>
-        </w:tblPrEx>
         <w:tc>
           <w:tcPr>
             <w:tcW w:w="1373" w:type="dxa"/>
@@ -5703,12 +5544,6 @@
         </w:tc>
       </w:tr>
       <w:tr>
-        <w:tblPrEx>
-          <w:tblCellMar>
-            <w:top w:w="0" w:type="dxa"/>
-            <w:bottom w:w="0" w:type="dxa"/>
-          </w:tblCellMar>
-        </w:tblPrEx>
         <w:tc>
           <w:tcPr>
             <w:tcW w:w="1373" w:type="dxa"/>
@@ -6079,12 +5914,6 @@
         </w:tc>
       </w:tr>
       <w:tr>
-        <w:tblPrEx>
-          <w:tblCellMar>
-            <w:top w:w="0" w:type="dxa"/>
-            <w:bottom w:w="0" w:type="dxa"/>
-          </w:tblCellMar>
-        </w:tblPrEx>
         <w:tc>
           <w:tcPr>
             <w:tcW w:w="1373" w:type="dxa"/>
@@ -6448,12 +6277,6 @@
         </w:tc>
       </w:tr>
       <w:tr>
-        <w:tblPrEx>
-          <w:tblCellMar>
-            <w:top w:w="0" w:type="dxa"/>
-            <w:bottom w:w="0" w:type="dxa"/>
-          </w:tblCellMar>
-        </w:tblPrEx>
         <w:tc>
           <w:tcPr>
             <w:tcW w:w="1373" w:type="dxa"/>
@@ -6824,12 +6647,6 @@
         </w:tc>
       </w:tr>
       <w:tr>
-        <w:tblPrEx>
-          <w:tblCellMar>
-            <w:top w:w="0" w:type="dxa"/>
-            <w:bottom w:w="0" w:type="dxa"/>
-          </w:tblCellMar>
-        </w:tblPrEx>
         <w:tc>
           <w:tcPr>
             <w:tcW w:w="1373" w:type="dxa"/>
@@ -7247,12 +7064,6 @@
         <w:gridCol w:w="4217"/>
       </w:tblGrid>
       <w:tr>
-        <w:tblPrEx>
-          <w:tblCellMar>
-            <w:top w:w="0" w:type="dxa"/>
-            <w:bottom w:w="0" w:type="dxa"/>
-          </w:tblCellMar>
-        </w:tblPrEx>
         <w:trPr>
           <w:tblHeader/>
         </w:trPr>
@@ -7374,12 +7185,6 @@
         </w:tc>
       </w:tr>
       <w:tr>
-        <w:tblPrEx>
-          <w:tblCellMar>
-            <w:top w:w="0" w:type="dxa"/>
-            <w:bottom w:w="0" w:type="dxa"/>
-          </w:tblCellMar>
-        </w:tblPrEx>
         <w:tc>
           <w:tcPr>
             <w:tcW w:w="2500" w:type="dxa"/>
@@ -7490,12 +7295,6 @@
         </w:tc>
       </w:tr>
       <w:tr>
-        <w:tblPrEx>
-          <w:tblCellMar>
-            <w:top w:w="0" w:type="dxa"/>
-            <w:bottom w:w="0" w:type="dxa"/>
-          </w:tblCellMar>
-        </w:tblPrEx>
         <w:tc>
           <w:tcPr>
             <w:tcW w:w="2500" w:type="dxa"/>
@@ -7606,12 +7405,6 @@
         </w:tc>
       </w:tr>
       <w:tr>
-        <w:tblPrEx>
-          <w:tblCellMar>
-            <w:top w:w="0" w:type="dxa"/>
-            <w:bottom w:w="0" w:type="dxa"/>
-          </w:tblCellMar>
-        </w:tblPrEx>
         <w:tc>
           <w:tcPr>
             <w:tcW w:w="2500" w:type="dxa"/>
@@ -7722,12 +7515,6 @@
         </w:tc>
       </w:tr>
       <w:tr>
-        <w:tblPrEx>
-          <w:tblCellMar>
-            <w:top w:w="0" w:type="dxa"/>
-            <w:bottom w:w="0" w:type="dxa"/>
-          </w:tblCellMar>
-        </w:tblPrEx>
         <w:tc>
           <w:tcPr>
             <w:tcW w:w="2500" w:type="dxa"/>
@@ -7751,6 +7538,7 @@
               <w:rPr>
                 <w:color w:val="000000"/>
               </w:rPr>
+              <w:lastRenderedPageBreak/>
               <w:t>Model staleness after 4–6 weeks of operation</w:t>
             </w:r>
           </w:p>
@@ -7838,12 +7626,6 @@
         </w:tc>
       </w:tr>
       <w:tr>
-        <w:tblPrEx>
-          <w:tblCellMar>
-            <w:top w:w="0" w:type="dxa"/>
-            <w:bottom w:w="0" w:type="dxa"/>
-          </w:tblCellMar>
-        </w:tblPrEx>
         <w:tc>
           <w:tcPr>
             <w:tcW w:w="2500" w:type="dxa"/>
@@ -7867,7 +7649,6 @@
               <w:rPr>
                 <w:color w:val="000000"/>
               </w:rPr>
-              <w:lastRenderedPageBreak/>
               <w:t>Committee questions cross-project generalization</w:t>
             </w:r>
           </w:p>
@@ -7970,7 +7751,7 @@
     </w:p>
     <w:p>
       <w:pPr>
-        <w:spacing w:after="120"/>
+        <w:pStyle w:val="font-claude-response-body"/>
       </w:pPr>
       <w:r>
         <w:rPr>
@@ -7980,7 +7761,118 @@
         <w:t>Primary dataset:</w:t>
       </w:r>
       <w:r>
-        <w:t xml:space="preserve"> Projects are drawn from the RTPTorrent benchmark (Mattis et al., 2020) [10], which provides 20 open-source Java projects with over 100,000 real-world TravisCI build logs and pre-computed reproducible baselines. This choice ensures direct comparability with the existing RTP research community. Projects will be selected from this corpus based on two criteria: (1) a minimum test failure rate of 5% across CI builds to ensure sufficient positive labels for model training, and (2) Maven or Gradle build configuration to enable Java-specific feature extraction. A proof-of-concept repository audit will be conducted in Week 1 of Month 1 to confirm dataset viability before committing to specific repositories.</w:t>
+        <w:t xml:space="preserve"> Projects are drawn from the RTPTorrent benchmark (Mattis et al., 2020) [10], which provides 20 open-source Java projects with over 100,000 real-world TravisCI build logs and pre-computed reproducible baselines. This choice ensures direct comparability with the existing RTP research community. </w:t>
+      </w:r>
+      <w:r>
+        <w:t xml:space="preserve">Projects are selected from this corpus based on three criteria: </w:t>
+      </w:r>
+    </w:p>
+    <w:p>
+      <w:pPr>
+        <w:pStyle w:val="font-claude-response-body"/>
+      </w:pPr>
+      <w:r>
+        <w:t xml:space="preserve">(1) </w:t>
+      </w:r>
+      <w:r>
+        <w:rPr>
+          <w:rStyle w:val="Strong"/>
+        </w:rPr>
+        <w:t>a minimum test failure rate of 1%</w:t>
+      </w:r>
+      <w:r>
+        <w:t xml:space="preserve"> across CI builds, verified against the loaded SQLite database (five projects qualify: </w:t>
+      </w:r>
+      <w:r>
+        <w:rPr>
+          <w:rStyle w:val="HTMLCode"/>
+          <w:rFonts w:ascii="Times New Roman" w:hAnsi="Times New Roman" w:cs="Times New Roman"/>
+          <w:sz w:val="24"/>
+          <w:szCs w:val="24"/>
+        </w:rPr>
+        <w:t>wicket-bootstrap</w:t>
+      </w:r>
+      <w:r>
+        <w:t xml:space="preserve"> 21.16%, </w:t>
+      </w:r>
+      <w:r>
+        <w:rPr>
+          <w:rStyle w:val="HTMLCode"/>
+          <w:rFonts w:ascii="Times New Roman" w:hAnsi="Times New Roman" w:cs="Times New Roman"/>
+          <w:sz w:val="24"/>
+          <w:szCs w:val="24"/>
+        </w:rPr>
+        <w:t>jade4j</w:t>
+      </w:r>
+      <w:r>
+        <w:t xml:space="preserve"> 19.61%, </w:t>
+      </w:r>
+      <w:r>
+        <w:rPr>
+          <w:rStyle w:val="HTMLCode"/>
+          <w:rFonts w:ascii="Times New Roman" w:hAnsi="Times New Roman" w:cs="Times New Roman"/>
+          <w:sz w:val="24"/>
+          <w:szCs w:val="24"/>
+        </w:rPr>
+        <w:t>deeplearning4j</w:t>
+      </w:r>
+      <w:r>
+        <w:t xml:space="preserve"> 7.76%, </w:t>
+      </w:r>
+      <w:r>
+        <w:rPr>
+          <w:rStyle w:val="HTMLCode"/>
+          <w:rFonts w:ascii="Times New Roman" w:hAnsi="Times New Roman" w:cs="Times New Roman"/>
+          <w:sz w:val="24"/>
+          <w:szCs w:val="24"/>
+        </w:rPr>
+        <w:t>LittleProxy</w:t>
+      </w:r>
+      <w:r>
+        <w:t xml:space="preserve"> 1.61%, </w:t>
+      </w:r>
+      <w:r>
+        <w:rPr>
+          <w:rStyle w:val="HTMLCode"/>
+          <w:rFonts w:ascii="Times New Roman" w:hAnsi="Times New Roman" w:cs="Times New Roman"/>
+          <w:sz w:val="24"/>
+          <w:szCs w:val="24"/>
+        </w:rPr>
+        <w:t>thinkaurelius@titan</w:t>
+      </w:r>
+      <w:r>
+        <w:t xml:space="preserve"> 1.25%);</w:t>
+      </w:r>
+    </w:p>
+    <w:p>
+      <w:pPr>
+        <w:pStyle w:val="font-claude-response-body"/>
+      </w:pPr>
+      <w:r>
+        <w:t>(2) a minimum of 100 CI builds to ensure sufficient temporal depth for time-aware splitting;</w:t>
+      </w:r>
+    </w:p>
+    <w:p>
+      <w:pPr>
+        <w:pStyle w:val="font-claude-response-body"/>
+      </w:pPr>
+      <w:r>
+        <w:t xml:space="preserve">(3) presence of an associated </w:t>
+      </w:r>
+      <w:r>
+        <w:rPr>
+          <w:rStyle w:val="HTMLCode"/>
+          <w:rFonts w:ascii="Times New Roman" w:hAnsi="Times New Roman" w:cs="Times New Roman"/>
+          <w:sz w:val="24"/>
+          <w:szCs w:val="24"/>
+        </w:rPr>
+        <w:t>patches.csv</w:t>
+      </w:r>
+      <w:r>
+        <w:t xml:space="preserve"> file required for commit-level feature extraction. A threshold of 1% was selected over the originally proposed 5% following empirical audit of the full 20-project corpus, which revealed that only three projects exceed 2% and no project exceeds the 5% threshold while simultaneously satisfying the build count and patches criteria. A sensitivity analysis comparing results at the ≥2% subset is reported in Appendix A</w:t>
+      </w:r>
+      <w:r>
+        <w:t>. A proof-of-concept repository audit will be conducted in Week 1 of Month 1 to confirm dataset viability before committing to specific repositories.</w:t>
       </w:r>
     </w:p>
     <w:p>
@@ -8036,7 +7928,11 @@
         <w:spacing w:after="120"/>
       </w:pPr>
       <w:r>
-        <w:t>Hardware: a standard development laptop (8GB RAM, 4-core CPU) is sufficient for model training on the expected dataset size of 10,000–50,000 samples. No GPU is required. Software: all tools are open-source (Python, Java, MLflow, Evidently AI, Docker). No licensed software or cloud compute budget is required for the research phase.</w:t>
+        <w:t xml:space="preserve">Hardware: a standard development laptop (8GB RAM, 4-core CPU) is sufficient for model training on the expected dataset size of 10,000–50,000 samples. No GPU is required. </w:t>
+      </w:r>
+      <w:r>
+        <w:lastRenderedPageBreak/>
+        <w:t>Software: all tools are open-source (Python, Java, MLflow, Evidently AI, Docker). No licensed software or cloud compute budget is required for the research phase.</w:t>
       </w:r>
     </w:p>
     <w:p>
@@ -8089,12 +7985,6 @@
         <w:gridCol w:w="1426"/>
       </w:tblGrid>
       <w:tr>
-        <w:tblPrEx>
-          <w:tblCellMar>
-            <w:top w:w="0" w:type="dxa"/>
-            <w:bottom w:w="0" w:type="dxa"/>
-          </w:tblCellMar>
-        </w:tblPrEx>
         <w:trPr>
           <w:tblHeader/>
         </w:trPr>
@@ -8187,12 +8077,6 @@
         </w:tc>
       </w:tr>
       <w:tr>
-        <w:tblPrEx>
-          <w:tblCellMar>
-            <w:top w:w="0" w:type="dxa"/>
-            <w:bottom w:w="0" w:type="dxa"/>
-          </w:tblCellMar>
-        </w:tblPrEx>
         <w:tc>
           <w:tcPr>
             <w:tcW w:w="2600" w:type="dxa"/>
@@ -8276,12 +8160,6 @@
         </w:tc>
       </w:tr>
       <w:tr>
-        <w:tblPrEx>
-          <w:tblCellMar>
-            <w:top w:w="0" w:type="dxa"/>
-            <w:bottom w:w="0" w:type="dxa"/>
-          </w:tblCellMar>
-        </w:tblPrEx>
         <w:tc>
           <w:tcPr>
             <w:tcW w:w="2600" w:type="dxa"/>
@@ -8365,12 +8243,6 @@
         </w:tc>
       </w:tr>
       <w:tr>
-        <w:tblPrEx>
-          <w:tblCellMar>
-            <w:top w:w="0" w:type="dxa"/>
-            <w:bottom w:w="0" w:type="dxa"/>
-          </w:tblCellMar>
-        </w:tblPrEx>
         <w:tc>
           <w:tcPr>
             <w:tcW w:w="2600" w:type="dxa"/>
@@ -8454,12 +8326,6 @@
         </w:tc>
       </w:tr>
       <w:tr>
-        <w:tblPrEx>
-          <w:tblCellMar>
-            <w:top w:w="0" w:type="dxa"/>
-            <w:bottom w:w="0" w:type="dxa"/>
-          </w:tblCellMar>
-        </w:tblPrEx>
         <w:tc>
           <w:tcPr>
             <w:tcW w:w="2600" w:type="dxa"/>
@@ -8543,12 +8409,6 @@
         </w:tc>
       </w:tr>
       <w:tr>
-        <w:tblPrEx>
-          <w:tblCellMar>
-            <w:top w:w="0" w:type="dxa"/>
-            <w:bottom w:w="0" w:type="dxa"/>
-          </w:tblCellMar>
-        </w:tblPrEx>
         <w:tc>
           <w:tcPr>
             <w:tcW w:w="2600" w:type="dxa"/>
@@ -8632,12 +8492,6 @@
         </w:tc>
       </w:tr>
       <w:tr>
-        <w:tblPrEx>
-          <w:tblCellMar>
-            <w:top w:w="0" w:type="dxa"/>
-            <w:bottom w:w="0" w:type="dxa"/>
-          </w:tblCellMar>
-        </w:tblPrEx>
         <w:tc>
           <w:tcPr>
             <w:tcW w:w="2600" w:type="dxa"/>
@@ -8721,12 +8575,6 @@
         </w:tc>
       </w:tr>
       <w:tr>
-        <w:tblPrEx>
-          <w:tblCellMar>
-            <w:top w:w="0" w:type="dxa"/>
-            <w:bottom w:w="0" w:type="dxa"/>
-          </w:tblCellMar>
-        </w:tblPrEx>
         <w:tc>
           <w:tcPr>
             <w:tcW w:w="2600" w:type="dxa"/>
@@ -8864,12 +8712,6 @@
         <w:gridCol w:w="3419"/>
       </w:tblGrid>
       <w:tr>
-        <w:tblPrEx>
-          <w:tblCellMar>
-            <w:top w:w="0" w:type="dxa"/>
-            <w:bottom w:w="0" w:type="dxa"/>
-          </w:tblCellMar>
-        </w:tblPrEx>
         <w:trPr>
           <w:tblHeader/>
         </w:trPr>
@@ -8991,12 +8833,6 @@
         </w:tc>
       </w:tr>
       <w:tr>
-        <w:tblPrEx>
-          <w:tblCellMar>
-            <w:top w:w="0" w:type="dxa"/>
-            <w:bottom w:w="0" w:type="dxa"/>
-          </w:tblCellMar>
-        </w:tblPrEx>
         <w:tc>
           <w:tcPr>
             <w:tcW w:w="800" w:type="dxa"/>
@@ -9097,22 +8933,16 @@
             <w:vAlign w:val="center"/>
           </w:tcPr>
           <w:p>
-            <w:r>
-              <w:rPr>
-                <w:color w:val="000000"/>
-              </w:rPr>
-              <w:t>Time-aware train/test split on ≥2 RTPTorrent repositories</w:t>
+            <w:pPr>
+              <w:pStyle w:val="font-claude-response-body"/>
+            </w:pPr>
+            <w:r>
+              <w:t>Time-aware train/test split on 5 RTPTorrent projects (failure rate ≥1%; sensitivity analysis at ≥2% in Appendix A)</w:t>
             </w:r>
           </w:p>
         </w:tc>
       </w:tr>
       <w:tr>
-        <w:tblPrEx>
-          <w:tblCellMar>
-            <w:top w:w="0" w:type="dxa"/>
-            <w:bottom w:w="0" w:type="dxa"/>
-          </w:tblCellMar>
-        </w:tblPrEx>
         <w:tc>
           <w:tcPr>
             <w:tcW w:w="800" w:type="dxa"/>
@@ -9223,12 +9053,6 @@
         </w:tc>
       </w:tr>
       <w:tr>
-        <w:tblPrEx>
-          <w:tblCellMar>
-            <w:top w:w="0" w:type="dxa"/>
-            <w:bottom w:w="0" w:type="dxa"/>
-          </w:tblCellMar>
-        </w:tblPrEx>
         <w:tc>
           <w:tcPr>
             <w:tcW w:w="800" w:type="dxa"/>
@@ -9339,12 +9163,6 @@
         </w:tc>
       </w:tr>
       <w:tr>
-        <w:tblPrEx>
-          <w:tblCellMar>
-            <w:top w:w="0" w:type="dxa"/>
-            <w:bottom w:w="0" w:type="dxa"/>
-          </w:tblCellMar>
-        </w:tblPrEx>
         <w:tc>
           <w:tcPr>
             <w:tcW w:w="800" w:type="dxa"/>
@@ -9600,7 +9418,7 @@
     </w:p>
     <w:p>
       <w:pPr>
-        <w:spacing w:after="120"/>
+        <w:pStyle w:val="font-claude-response-body"/>
       </w:pPr>
       <w:r>
         <w:rPr>
@@ -9610,22 +9428,28 @@
         <w:t>Time-aware split</w:t>
       </w:r>
       <w:r>
-        <w:t xml:space="preserve"> is used throughout — the dataset is divided chronologically, with the earlier portion used for training and the later portion for testing. Random split is explicitly avoided to prevent data leakage from future commits informing past predictions. The split ratio is 70% train / 30% test on the time axis.</w:t>
-      </w:r>
-    </w:p>
-    <w:p>
-      <w:pPr>
-        <w:spacing w:after="120"/>
-      </w:pPr>
-      <w:r>
         <w:rPr>
           <w:b/>
           <w:bCs/>
         </w:rPr>
+        <w:t>:</w:t>
+      </w:r>
+      <w:r>
+        <w:t xml:space="preserve"> is used throughout — the dataset is divided chronologically, with the earlier portion used for training and the later portion for testing. Random split is explicitly avoided to prevent data leakage from future commits informing past predictions. The split ratio is 80% train / 20% test on the time axis, applied independently per project to preserve each project's temporal distribution.</w:t>
+      </w:r>
+    </w:p>
+    <w:p>
+      <w:pPr>
+        <w:pStyle w:val="font-claude-response-body"/>
+      </w:pPr>
+      <w:r>
+        <w:rPr>
+          <w:rStyle w:val="Strong"/>
+        </w:rPr>
         <w:t>Repository diversity</w:t>
       </w:r>
       <w:r>
-        <w:t>: evaluation on a minimum of two independent repositories from the RTPTorrent benchmark is required to avoid over-fitting results to a single project's characteristics. Results are reported separately per repository; aggregate statistics are reported as supplementary information only.</w:t>
+        <w:t>: evaluation is conducted on five Java projects drawn from the RTPTorrent benchmark, selected to represent variation across project size (10,288–138,155 LOC), domain (UI framework, graph database, networking library, deep learning, template engine), build volume (374–1,110 CI builds), and failure rate (1.46%–21.16%). The minimum failure rate threshold is set at 1% to balance diversity with statistical power; results on the three-project subset meeting the stricter ≥2% threshold are reported in Appendix A as a sensitivity check. The train/test split ratio is 80%/20%, applied independently per project to preserve each project's temporal distribution. Results are reported separately per project; aggregate statistics are reported as supplementary information only.</w:t>
       </w:r>
     </w:p>
     <w:p>
@@ -9688,12 +9512,6 @@
         <w:gridCol w:w="1426"/>
       </w:tblGrid>
       <w:tr>
-        <w:tblPrEx>
-          <w:tblCellMar>
-            <w:top w:w="0" w:type="dxa"/>
-            <w:bottom w:w="0" w:type="dxa"/>
-          </w:tblCellMar>
-        </w:tblPrEx>
         <w:trPr>
           <w:tblHeader/>
         </w:trPr>
@@ -9815,12 +9633,6 @@
         </w:tc>
       </w:tr>
       <w:tr>
-        <w:tblPrEx>
-          <w:tblCellMar>
-            <w:top w:w="0" w:type="dxa"/>
-            <w:bottom w:w="0" w:type="dxa"/>
-          </w:tblCellMar>
-        </w:tblPrEx>
         <w:tc>
           <w:tcPr>
             <w:tcW w:w="2400" w:type="dxa"/>
@@ -9931,12 +9743,6 @@
         </w:tc>
       </w:tr>
       <w:tr>
-        <w:tblPrEx>
-          <w:tblCellMar>
-            <w:top w:w="0" w:type="dxa"/>
-            <w:bottom w:w="0" w:type="dxa"/>
-          </w:tblCellMar>
-        </w:tblPrEx>
         <w:tc>
           <w:tcPr>
             <w:tcW w:w="2400" w:type="dxa"/>
@@ -9960,6 +9766,7 @@
               <w:rPr>
                 <w:color w:val="000000"/>
               </w:rPr>
+              <w:lastRenderedPageBreak/>
               <w:t>Code churn</w:t>
             </w:r>
           </w:p>
@@ -10047,12 +9854,6 @@
         </w:tc>
       </w:tr>
       <w:tr>
-        <w:tblPrEx>
-          <w:tblCellMar>
-            <w:top w:w="0" w:type="dxa"/>
-            <w:bottom w:w="0" w:type="dxa"/>
-          </w:tblCellMar>
-        </w:tblPrEx>
         <w:tc>
           <w:tcPr>
             <w:tcW w:w="2400" w:type="dxa"/>
@@ -10163,12 +9964,6 @@
         </w:tc>
       </w:tr>
       <w:tr>
-        <w:tblPrEx>
-          <w:tblCellMar>
-            <w:top w:w="0" w:type="dxa"/>
-            <w:bottom w:w="0" w:type="dxa"/>
-          </w:tblCellMar>
-        </w:tblPrEx>
         <w:tc>
           <w:tcPr>
             <w:tcW w:w="2400" w:type="dxa"/>
@@ -10279,12 +10074,6 @@
         </w:tc>
       </w:tr>
       <w:tr>
-        <w:tblPrEx>
-          <w:tblCellMar>
-            <w:top w:w="0" w:type="dxa"/>
-            <w:bottom w:w="0" w:type="dxa"/>
-          </w:tblCellMar>
-        </w:tblPrEx>
         <w:tc>
           <w:tcPr>
             <w:tcW w:w="2400" w:type="dxa"/>
@@ -10308,7 +10097,6 @@
               <w:rPr>
                 <w:color w:val="000000"/>
               </w:rPr>
-              <w:lastRenderedPageBreak/>
               <w:t>JUnit annotation semantics (*)</w:t>
             </w:r>
           </w:p>
@@ -10396,12 +10184,6 @@
         </w:tc>
       </w:tr>
       <w:tr>
-        <w:tblPrEx>
-          <w:tblCellMar>
-            <w:top w:w="0" w:type="dxa"/>
-            <w:bottom w:w="0" w:type="dxa"/>
-          </w:tblCellMar>
-        </w:tblPrEx>
         <w:tc>
           <w:tcPr>
             <w:tcW w:w="2400" w:type="dxa"/>
@@ -10671,7 +10453,7 @@
 </file>
 
 <file path=word/endnotes.xml><?xml version="1.0" encoding="utf-8"?>
-<w:endnotes xmlns:wpc="http://schemas.microsoft.com/office/word/2010/wordprocessingCanvas" xmlns:cx="http://schemas.microsoft.com/office/drawing/2014/chartex" xmlns:cx1="http://schemas.microsoft.com/office/drawing/2015/9/8/chartex" xmlns:cx2="http://schemas.microsoft.com/office/drawing/2015/10/21/chartex" xmlns:cx3="http://schemas.microsoft.com/office/drawing/2016/5/9/chartex" xmlns:cx4="http://schemas.microsoft.com/office/drawing/2016/5/10/chartex" xmlns:cx5="http://schemas.microsoft.com/office/drawing/2016/5/11/chartex" xmlns:cx6="http://schemas.microsoft.com/office/drawing/2016/5/12/chartex" xmlns:cx7="http://schemas.microsoft.com/office/drawing/2016/5/13/chartex" xmlns:cx8="http://schemas.microsoft.com/office/drawing/2016/5/14/chartex" xmlns:mc="http://schemas.openxmlformats.org/markup-compatibility/2006" xmlns:aink="http://schemas.microsoft.com/office/drawing/2016/ink" xmlns:am3d="http://schemas.microsoft.com/office/drawing/2017/model3d" xmlns:o="urn:schemas-microsoft-com:office:office" xmlns:oel="http://schemas.microsoft.com/office/2019/extlst" xmlns:r="http://schemas.openxmlformats.org/officeDocument/2006/relationships" xmlns:m="http://schemas.openxmlformats.org/officeDocument/2006/math" xmlns:v="urn:schemas-microsoft-com:vml" xmlns:wp14="http://schemas.microsoft.com/office/word/2010/wordprocessingDrawing" xmlns:wp="http://schemas.openxmlformats.org/drawingml/2006/wordprocessingDrawing" xmlns:w10="urn:schemas-microsoft-com:office:word" xmlns:w="http://schemas.openxmlformats.org/wordprocessingml/2006/main" xmlns:w14="http://schemas.microsoft.com/office/word/2010/wordml" xmlns:w15="http://schemas.microsoft.com/office/word/2012/wordml" xmlns:w16cex="http://schemas.microsoft.com/office/word/2018/wordml/cex" xmlns:w16cid="http://schemas.microsoft.com/office/word/2016/wordml/cid" xmlns:w16="http://schemas.microsoft.com/office/word/2018/wordml" xmlns:w16du="http://schemas.microsoft.com/office/word/2023/wordml/word16du" xmlns:w16sdtdh="http://schemas.microsoft.com/office/word/2020/wordml/sdtdatahash" xmlns:w16sdtfl="http://schemas.microsoft.com/office/word/2024/wordml/sdtformatlock" xmlns:w16se="http://schemas.microsoft.com/office/word/2015/wordml/symex" xmlns:wpg="http://schemas.microsoft.com/office/word/2010/wordprocessingGroup" xmlns:wpi="http://schemas.microsoft.com/office/word/2010/wordprocessingInk" xmlns:wne="http://schemas.microsoft.com/office/word/2006/wordml" xmlns:wps="http://schemas.microsoft.com/office/word/2010/wordprocessingShape" mc:Ignorable="w14 w15 w16se w16cid w16 w16cex w16sdtdh w16sdtfl w16du wp14">
+<w:endnotes xmlns:wpc="http://schemas.microsoft.com/office/word/2010/wordprocessingCanvas" xmlns:cx="http://schemas.microsoft.com/office/drawing/2014/chartex" xmlns:cx1="http://schemas.microsoft.com/office/drawing/2015/9/8/chartex" xmlns:cx2="http://schemas.microsoft.com/office/drawing/2015/10/21/chartex" xmlns:cx3="http://schemas.microsoft.com/office/drawing/2016/5/9/chartex" xmlns:cx4="http://schemas.microsoft.com/office/drawing/2016/5/10/chartex" xmlns:cx5="http://schemas.microsoft.com/office/drawing/2016/5/11/chartex" xmlns:cx6="http://schemas.microsoft.com/office/drawing/2016/5/12/chartex" xmlns:cx7="http://schemas.microsoft.com/office/drawing/2016/5/13/chartex" xmlns:cx8="http://schemas.microsoft.com/office/drawing/2016/5/14/chartex" xmlns:mc="http://schemas.openxmlformats.org/markup-compatibility/2006" xmlns:aink="http://schemas.microsoft.com/office/drawing/2016/ink" xmlns:am3d="http://schemas.microsoft.com/office/drawing/2017/model3d" xmlns:o="urn:schemas-microsoft-com:office:office" xmlns:oel="http://schemas.microsoft.com/office/2019/extlst" xmlns:r="http://schemas.openxmlformats.org/officeDocument/2006/relationships" xmlns:m="http://schemas.openxmlformats.org/officeDocument/2006/math" xmlns:v="urn:schemas-microsoft-com:vml" xmlns:wp14="http://schemas.microsoft.com/office/word/2010/wordprocessingDrawing" xmlns:wp="http://schemas.openxmlformats.org/drawingml/2006/wordprocessingDrawing" xmlns:w10="urn:schemas-microsoft-com:office:word" xmlns:w="http://schemas.openxmlformats.org/wordprocessingml/2006/main" xmlns:w14="http://schemas.microsoft.com/office/word/2010/wordml" xmlns:w15="http://schemas.microsoft.com/office/word/2012/wordml" xmlns:w16cex="http://schemas.microsoft.com/office/word/2018/wordml/cex" xmlns:w16cid="http://schemas.microsoft.com/office/word/2016/wordml/cid" xmlns:w16="http://schemas.microsoft.com/office/word/2018/wordml" xmlns:w16du="http://schemas.microsoft.com/office/word/2023/wordml/word16du" xmlns:w16sdtdh="http://schemas.microsoft.com/office/word/2020/wordml/sdtdatahash" xmlns:w16se="http://schemas.microsoft.com/office/word/2015/wordml/symex" xmlns:wpg="http://schemas.microsoft.com/office/word/2010/wordprocessingGroup" xmlns:wpi="http://schemas.microsoft.com/office/word/2010/wordprocessingInk" xmlns:wne="http://schemas.microsoft.com/office/word/2006/wordml" xmlns:wps="http://schemas.microsoft.com/office/word/2010/wordprocessingShape" mc:Ignorable="w14 w15 w16se w16cid w16 w16cex w16sdtdh w16du wp14">
   <w:endnote w:type="separator" w:id="-1">
     <w:p>
       <w:r>
@@ -10690,7 +10472,7 @@
 </file>
 
 <file path=word/footer1.xml><?xml version="1.0" encoding="utf-8"?>
-<w:ftr xmlns:wpc="http://schemas.microsoft.com/office/word/2010/wordprocessingCanvas" xmlns:cx="http://schemas.microsoft.com/office/drawing/2014/chartex" xmlns:cx1="http://schemas.microsoft.com/office/drawing/2015/9/8/chartex" xmlns:cx2="http://schemas.microsoft.com/office/drawing/2015/10/21/chartex" xmlns:cx3="http://schemas.microsoft.com/office/drawing/2016/5/9/chartex" xmlns:cx4="http://schemas.microsoft.com/office/drawing/2016/5/10/chartex" xmlns:cx5="http://schemas.microsoft.com/office/drawing/2016/5/11/chartex" xmlns:cx6="http://schemas.microsoft.com/office/drawing/2016/5/12/chartex" xmlns:cx7="http://schemas.microsoft.com/office/drawing/2016/5/13/chartex" xmlns:cx8="http://schemas.microsoft.com/office/drawing/2016/5/14/chartex" xmlns:mc="http://schemas.openxmlformats.org/markup-compatibility/2006" xmlns:aink="http://schemas.microsoft.com/office/drawing/2016/ink" xmlns:am3d="http://schemas.microsoft.com/office/drawing/2017/model3d" xmlns:o="urn:schemas-microsoft-com:office:office" xmlns:oel="http://schemas.microsoft.com/office/2019/extlst" xmlns:r="http://schemas.openxmlformats.org/officeDocument/2006/relationships" xmlns:m="http://schemas.openxmlformats.org/officeDocument/2006/math" xmlns:v="urn:schemas-microsoft-com:vml" xmlns:wp14="http://schemas.microsoft.com/office/word/2010/wordprocessingDrawing" xmlns:wp="http://schemas.openxmlformats.org/drawingml/2006/wordprocessingDrawing" xmlns:w10="urn:schemas-microsoft-com:office:word" xmlns:w="http://schemas.openxmlformats.org/wordprocessingml/2006/main" xmlns:w14="http://schemas.microsoft.com/office/word/2010/wordml" xmlns:w15="http://schemas.microsoft.com/office/word/2012/wordml" xmlns:w16cex="http://schemas.microsoft.com/office/word/2018/wordml/cex" xmlns:w16cid="http://schemas.microsoft.com/office/word/2016/wordml/cid" xmlns:w16="http://schemas.microsoft.com/office/word/2018/wordml" xmlns:w16du="http://schemas.microsoft.com/office/word/2023/wordml/word16du" xmlns:w16sdtdh="http://schemas.microsoft.com/office/word/2020/wordml/sdtdatahash" xmlns:w16sdtfl="http://schemas.microsoft.com/office/word/2024/wordml/sdtformatlock" xmlns:w16se="http://schemas.microsoft.com/office/word/2015/wordml/symex" xmlns:wpg="http://schemas.microsoft.com/office/word/2010/wordprocessingGroup" xmlns:wpi="http://schemas.microsoft.com/office/word/2010/wordprocessingInk" xmlns:wne="http://schemas.microsoft.com/office/word/2006/wordml" xmlns:wps="http://schemas.microsoft.com/office/word/2010/wordprocessingShape" mc:Ignorable="w14 w15 w16se w16cid w16 w16cex w16sdtdh w16sdtfl w16du wp14">
+<w:ftr xmlns:wpc="http://schemas.microsoft.com/office/word/2010/wordprocessingCanvas" xmlns:cx="http://schemas.microsoft.com/office/drawing/2014/chartex" xmlns:cx1="http://schemas.microsoft.com/office/drawing/2015/9/8/chartex" xmlns:cx2="http://schemas.microsoft.com/office/drawing/2015/10/21/chartex" xmlns:cx3="http://schemas.microsoft.com/office/drawing/2016/5/9/chartex" xmlns:cx4="http://schemas.microsoft.com/office/drawing/2016/5/10/chartex" xmlns:cx5="http://schemas.microsoft.com/office/drawing/2016/5/11/chartex" xmlns:cx6="http://schemas.microsoft.com/office/drawing/2016/5/12/chartex" xmlns:cx7="http://schemas.microsoft.com/office/drawing/2016/5/13/chartex" xmlns:cx8="http://schemas.microsoft.com/office/drawing/2016/5/14/chartex" xmlns:mc="http://schemas.openxmlformats.org/markup-compatibility/2006" xmlns:aink="http://schemas.microsoft.com/office/drawing/2016/ink" xmlns:am3d="http://schemas.microsoft.com/office/drawing/2017/model3d" xmlns:o="urn:schemas-microsoft-com:office:office" xmlns:oel="http://schemas.microsoft.com/office/2019/extlst" xmlns:r="http://schemas.openxmlformats.org/officeDocument/2006/relationships" xmlns:m="http://schemas.openxmlformats.org/officeDocument/2006/math" xmlns:v="urn:schemas-microsoft-com:vml" xmlns:wp14="http://schemas.microsoft.com/office/word/2010/wordprocessingDrawing" xmlns:wp="http://schemas.openxmlformats.org/drawingml/2006/wordprocessingDrawing" xmlns:w10="urn:schemas-microsoft-com:office:word" xmlns:w="http://schemas.openxmlformats.org/wordprocessingml/2006/main" xmlns:w14="http://schemas.microsoft.com/office/word/2010/wordml" xmlns:w15="http://schemas.microsoft.com/office/word/2012/wordml" xmlns:w16cex="http://schemas.microsoft.com/office/word/2018/wordml/cex" xmlns:w16cid="http://schemas.microsoft.com/office/word/2016/wordml/cid" xmlns:w16="http://schemas.microsoft.com/office/word/2018/wordml" xmlns:w16du="http://schemas.microsoft.com/office/word/2023/wordml/word16du" xmlns:w16sdtdh="http://schemas.microsoft.com/office/word/2020/wordml/sdtdatahash" xmlns:w16se="http://schemas.microsoft.com/office/word/2015/wordml/symex" xmlns:wpg="http://schemas.microsoft.com/office/word/2010/wordprocessingGroup" xmlns:wpi="http://schemas.microsoft.com/office/word/2010/wordprocessingInk" xmlns:wne="http://schemas.microsoft.com/office/word/2006/wordml" xmlns:wps="http://schemas.microsoft.com/office/word/2010/wordprocessingShape" mc:Ignorable="w14 w15 w16se w16cid w16 w16cex w16sdtdh w16du wp14">
   <w:p>
     <w:pPr>
       <w:pBdr>
@@ -10813,7 +10595,7 @@
 </file>
 
 <file path=word/footnotes.xml><?xml version="1.0" encoding="utf-8"?>
-<w:footnotes xmlns:wpc="http://schemas.microsoft.com/office/word/2010/wordprocessingCanvas" xmlns:cx="http://schemas.microsoft.com/office/drawing/2014/chartex" xmlns:cx1="http://schemas.microsoft.com/office/drawing/2015/9/8/chartex" xmlns:cx2="http://schemas.microsoft.com/office/drawing/2015/10/21/chartex" xmlns:cx3="http://schemas.microsoft.com/office/drawing/2016/5/9/chartex" xmlns:cx4="http://schemas.microsoft.com/office/drawing/2016/5/10/chartex" xmlns:cx5="http://schemas.microsoft.com/office/drawing/2016/5/11/chartex" xmlns:cx6="http://schemas.microsoft.com/office/drawing/2016/5/12/chartex" xmlns:cx7="http://schemas.microsoft.com/office/drawing/2016/5/13/chartex" xmlns:cx8="http://schemas.microsoft.com/office/drawing/2016/5/14/chartex" xmlns:mc="http://schemas.openxmlformats.org/markup-compatibility/2006" xmlns:aink="http://schemas.microsoft.com/office/drawing/2016/ink" xmlns:am3d="http://schemas.microsoft.com/office/drawing/2017/model3d" xmlns:o="urn:schemas-microsoft-com:office:office" xmlns:oel="http://schemas.microsoft.com/office/2019/extlst" xmlns:r="http://schemas.openxmlformats.org/officeDocument/2006/relationships" xmlns:m="http://schemas.openxmlformats.org/officeDocument/2006/math" xmlns:v="urn:schemas-microsoft-com:vml" xmlns:wp14="http://schemas.microsoft.com/office/word/2010/wordprocessingDrawing" xmlns:wp="http://schemas.openxmlformats.org/drawingml/2006/wordprocessingDrawing" xmlns:w10="urn:schemas-microsoft-com:office:word" xmlns:w="http://schemas.openxmlformats.org/wordprocessingml/2006/main" xmlns:w14="http://schemas.microsoft.com/office/word/2010/wordml" xmlns:w15="http://schemas.microsoft.com/office/word/2012/wordml" xmlns:w16cex="http://schemas.microsoft.com/office/word/2018/wordml/cex" xmlns:w16cid="http://schemas.microsoft.com/office/word/2016/wordml/cid" xmlns:w16="http://schemas.microsoft.com/office/word/2018/wordml" xmlns:w16du="http://schemas.microsoft.com/office/word/2023/wordml/word16du" xmlns:w16sdtdh="http://schemas.microsoft.com/office/word/2020/wordml/sdtdatahash" xmlns:w16sdtfl="http://schemas.microsoft.com/office/word/2024/wordml/sdtformatlock" xmlns:w16se="http://schemas.microsoft.com/office/word/2015/wordml/symex" xmlns:wpg="http://schemas.microsoft.com/office/word/2010/wordprocessingGroup" xmlns:wpi="http://schemas.microsoft.com/office/word/2010/wordprocessingInk" xmlns:wne="http://schemas.microsoft.com/office/word/2006/wordml" xmlns:wps="http://schemas.microsoft.com/office/word/2010/wordprocessingShape" mc:Ignorable="w14 w15 w16se w16cid w16 w16cex w16sdtdh w16sdtfl w16du wp14">
+<w:footnotes xmlns:wpc="http://schemas.microsoft.com/office/word/2010/wordprocessingCanvas" xmlns:cx="http://schemas.microsoft.com/office/drawing/2014/chartex" xmlns:cx1="http://schemas.microsoft.com/office/drawing/2015/9/8/chartex" xmlns:cx2="http://schemas.microsoft.com/office/drawing/2015/10/21/chartex" xmlns:cx3="http://schemas.microsoft.com/office/drawing/2016/5/9/chartex" xmlns:cx4="http://schemas.microsoft.com/office/drawing/2016/5/10/chartex" xmlns:cx5="http://schemas.microsoft.com/office/drawing/2016/5/11/chartex" xmlns:cx6="http://schemas.microsoft.com/office/drawing/2016/5/12/chartex" xmlns:cx7="http://schemas.microsoft.com/office/drawing/2016/5/13/chartex" xmlns:cx8="http://schemas.microsoft.com/office/drawing/2016/5/14/chartex" xmlns:mc="http://schemas.openxmlformats.org/markup-compatibility/2006" xmlns:aink="http://schemas.microsoft.com/office/drawing/2016/ink" xmlns:am3d="http://schemas.microsoft.com/office/drawing/2017/model3d" xmlns:o="urn:schemas-microsoft-com:office:office" xmlns:oel="http://schemas.microsoft.com/office/2019/extlst" xmlns:r="http://schemas.openxmlformats.org/officeDocument/2006/relationships" xmlns:m="http://schemas.openxmlformats.org/officeDocument/2006/math" xmlns:v="urn:schemas-microsoft-com:vml" xmlns:wp14="http://schemas.microsoft.com/office/word/2010/wordprocessingDrawing" xmlns:wp="http://schemas.openxmlformats.org/drawingml/2006/wordprocessingDrawing" xmlns:w10="urn:schemas-microsoft-com:office:word" xmlns:w="http://schemas.openxmlformats.org/wordprocessingml/2006/main" xmlns:w14="http://schemas.microsoft.com/office/word/2010/wordml" xmlns:w15="http://schemas.microsoft.com/office/word/2012/wordml" xmlns:w16cex="http://schemas.microsoft.com/office/word/2018/wordml/cex" xmlns:w16cid="http://schemas.microsoft.com/office/word/2016/wordml/cid" xmlns:w16="http://schemas.microsoft.com/office/word/2018/wordml" xmlns:w16du="http://schemas.microsoft.com/office/word/2023/wordml/word16du" xmlns:w16sdtdh="http://schemas.microsoft.com/office/word/2020/wordml/sdtdatahash" xmlns:w16se="http://schemas.microsoft.com/office/word/2015/wordml/symex" xmlns:wpg="http://schemas.microsoft.com/office/word/2010/wordprocessingGroup" xmlns:wpi="http://schemas.microsoft.com/office/word/2010/wordprocessingInk" xmlns:wne="http://schemas.microsoft.com/office/word/2006/wordml" xmlns:wps="http://schemas.microsoft.com/office/word/2010/wordprocessingShape" mc:Ignorable="w14 w15 w16se w16cid w16 w16cex w16sdtdh w16du wp14">
   <w:footnote w:type="separator" w:id="-1">
     <w:p>
       <w:r>
@@ -10832,7 +10614,7 @@
 </file>
 
 <file path=word/header1.xml><?xml version="1.0" encoding="utf-8"?>
-<w:hdr xmlns:wpc="http://schemas.microsoft.com/office/word/2010/wordprocessingCanvas" xmlns:cx="http://schemas.microsoft.com/office/drawing/2014/chartex" xmlns:cx1="http://schemas.microsoft.com/office/drawing/2015/9/8/chartex" xmlns:cx2="http://schemas.microsoft.com/office/drawing/2015/10/21/chartex" xmlns:cx3="http://schemas.microsoft.com/office/drawing/2016/5/9/chartex" xmlns:cx4="http://schemas.microsoft.com/office/drawing/2016/5/10/chartex" xmlns:cx5="http://schemas.microsoft.com/office/drawing/2016/5/11/chartex" xmlns:cx6="http://schemas.microsoft.com/office/drawing/2016/5/12/chartex" xmlns:cx7="http://schemas.microsoft.com/office/drawing/2016/5/13/chartex" xmlns:cx8="http://schemas.microsoft.com/office/drawing/2016/5/14/chartex" xmlns:mc="http://schemas.openxmlformats.org/markup-compatibility/2006" xmlns:aink="http://schemas.microsoft.com/office/drawing/2016/ink" xmlns:am3d="http://schemas.microsoft.com/office/drawing/2017/model3d" xmlns:o="urn:schemas-microsoft-com:office:office" xmlns:oel="http://schemas.microsoft.com/office/2019/extlst" xmlns:r="http://schemas.openxmlformats.org/officeDocument/2006/relationships" xmlns:m="http://schemas.openxmlformats.org/officeDocument/2006/math" xmlns:v="urn:schemas-microsoft-com:vml" xmlns:wp14="http://schemas.microsoft.com/office/word/2010/wordprocessingDrawing" xmlns:wp="http://schemas.openxmlformats.org/drawingml/2006/wordprocessingDrawing" xmlns:w10="urn:schemas-microsoft-com:office:word" xmlns:w="http://schemas.openxmlformats.org/wordprocessingml/2006/main" xmlns:w14="http://schemas.microsoft.com/office/word/2010/wordml" xmlns:w15="http://schemas.microsoft.com/office/word/2012/wordml" xmlns:w16cex="http://schemas.microsoft.com/office/word/2018/wordml/cex" xmlns:w16cid="http://schemas.microsoft.com/office/word/2016/wordml/cid" xmlns:w16="http://schemas.microsoft.com/office/word/2018/wordml" xmlns:w16du="http://schemas.microsoft.com/office/word/2023/wordml/word16du" xmlns:w16sdtdh="http://schemas.microsoft.com/office/word/2020/wordml/sdtdatahash" xmlns:w16sdtfl="http://schemas.microsoft.com/office/word/2024/wordml/sdtformatlock" xmlns:w16se="http://schemas.microsoft.com/office/word/2015/wordml/symex" xmlns:wpg="http://schemas.microsoft.com/office/word/2010/wordprocessingGroup" xmlns:wpi="http://schemas.microsoft.com/office/word/2010/wordprocessingInk" xmlns:wne="http://schemas.microsoft.com/office/word/2006/wordml" xmlns:wps="http://schemas.microsoft.com/office/word/2010/wordprocessingShape" mc:Ignorable="w14 w15 w16se w16cid w16 w16cex w16sdtdh w16sdtfl w16du wp14">
+<w:hdr xmlns:wpc="http://schemas.microsoft.com/office/word/2010/wordprocessingCanvas" xmlns:cx="http://schemas.microsoft.com/office/drawing/2014/chartex" xmlns:cx1="http://schemas.microsoft.com/office/drawing/2015/9/8/chartex" xmlns:cx2="http://schemas.microsoft.com/office/drawing/2015/10/21/chartex" xmlns:cx3="http://schemas.microsoft.com/office/drawing/2016/5/9/chartex" xmlns:cx4="http://schemas.microsoft.com/office/drawing/2016/5/10/chartex" xmlns:cx5="http://schemas.microsoft.com/office/drawing/2016/5/11/chartex" xmlns:cx6="http://schemas.microsoft.com/office/drawing/2016/5/12/chartex" xmlns:cx7="http://schemas.microsoft.com/office/drawing/2016/5/13/chartex" xmlns:cx8="http://schemas.microsoft.com/office/drawing/2016/5/14/chartex" xmlns:mc="http://schemas.openxmlformats.org/markup-compatibility/2006" xmlns:aink="http://schemas.microsoft.com/office/drawing/2016/ink" xmlns:am3d="http://schemas.microsoft.com/office/drawing/2017/model3d" xmlns:o="urn:schemas-microsoft-com:office:office" xmlns:oel="http://schemas.microsoft.com/office/2019/extlst" xmlns:r="http://schemas.openxmlformats.org/officeDocument/2006/relationships" xmlns:m="http://schemas.openxmlformats.org/officeDocument/2006/math" xmlns:v="urn:schemas-microsoft-com:vml" xmlns:wp14="http://schemas.microsoft.com/office/word/2010/wordprocessingDrawing" xmlns:wp="http://schemas.openxmlformats.org/drawingml/2006/wordprocessingDrawing" xmlns:w10="urn:schemas-microsoft-com:office:word" xmlns:w="http://schemas.openxmlformats.org/wordprocessingml/2006/main" xmlns:w14="http://schemas.microsoft.com/office/word/2010/wordml" xmlns:w15="http://schemas.microsoft.com/office/word/2012/wordml" xmlns:w16cex="http://schemas.microsoft.com/office/word/2018/wordml/cex" xmlns:w16cid="http://schemas.microsoft.com/office/word/2016/wordml/cid" xmlns:w16="http://schemas.microsoft.com/office/word/2018/wordml" xmlns:w16du="http://schemas.microsoft.com/office/word/2023/wordml/word16du" xmlns:w16sdtdh="http://schemas.microsoft.com/office/word/2020/wordml/sdtdatahash" xmlns:w16se="http://schemas.microsoft.com/office/word/2015/wordml/symex" xmlns:wpg="http://schemas.microsoft.com/office/word/2010/wordprocessingGroup" xmlns:wpi="http://schemas.microsoft.com/office/word/2010/wordprocessingInk" xmlns:wne="http://schemas.microsoft.com/office/word/2006/wordml" xmlns:wps="http://schemas.microsoft.com/office/word/2010/wordprocessingShape" mc:Ignorable="w14 w15 w16se w16cid w16 w16cex w16sdtdh w16du wp14">
   <w:p>
     <w:pPr>
       <w:pBdr>
@@ -10854,7 +10636,7 @@
 </file>
 
 <file path=word/numbering.xml><?xml version="1.0" encoding="utf-8"?>
-<w:numbering xmlns:wpc="http://schemas.microsoft.com/office/word/2010/wordprocessingCanvas" xmlns:cx="http://schemas.microsoft.com/office/drawing/2014/chartex" xmlns:cx1="http://schemas.microsoft.com/office/drawing/2015/9/8/chartex" xmlns:cx2="http://schemas.microsoft.com/office/drawing/2015/10/21/chartex" xmlns:cx3="http://schemas.microsoft.com/office/drawing/2016/5/9/chartex" xmlns:cx4="http://schemas.microsoft.com/office/drawing/2016/5/10/chartex" xmlns:cx5="http://schemas.microsoft.com/office/drawing/2016/5/11/chartex" xmlns:cx6="http://schemas.microsoft.com/office/drawing/2016/5/12/chartex" xmlns:cx7="http://schemas.microsoft.com/office/drawing/2016/5/13/chartex" xmlns:cx8="http://schemas.microsoft.com/office/drawing/2016/5/14/chartex" xmlns:mc="http://schemas.openxmlformats.org/markup-compatibility/2006" xmlns:aink="http://schemas.microsoft.com/office/drawing/2016/ink" xmlns:am3d="http://schemas.microsoft.com/office/drawing/2017/model3d" xmlns:o="urn:schemas-microsoft-com:office:office" xmlns:oel="http://schemas.microsoft.com/office/2019/extlst" xmlns:r="http://schemas.openxmlformats.org/officeDocument/2006/relationships" xmlns:m="http://schemas.openxmlformats.org/officeDocument/2006/math" xmlns:v="urn:schemas-microsoft-com:vml" xmlns:wp14="http://schemas.microsoft.com/office/word/2010/wordprocessingDrawing" xmlns:wp="http://schemas.openxmlformats.org/drawingml/2006/wordprocessingDrawing" xmlns:w10="urn:schemas-microsoft-com:office:word" xmlns:w="http://schemas.openxmlformats.org/wordprocessingml/2006/main" xmlns:w14="http://schemas.microsoft.com/office/word/2010/wordml" xmlns:w15="http://schemas.microsoft.com/office/word/2012/wordml" xmlns:w16cex="http://schemas.microsoft.com/office/word/2018/wordml/cex" xmlns:w16cid="http://schemas.microsoft.com/office/word/2016/wordml/cid" xmlns:w16="http://schemas.microsoft.com/office/word/2018/wordml" xmlns:w16du="http://schemas.microsoft.com/office/word/2023/wordml/word16du" xmlns:w16sdtdh="http://schemas.microsoft.com/office/word/2020/wordml/sdtdatahash" xmlns:w16sdtfl="http://schemas.microsoft.com/office/word/2024/wordml/sdtformatlock" xmlns:w16se="http://schemas.microsoft.com/office/word/2015/wordml/symex" xmlns:wpg="http://schemas.microsoft.com/office/word/2010/wordprocessingGroup" xmlns:wpi="http://schemas.microsoft.com/office/word/2010/wordprocessingInk" xmlns:wne="http://schemas.microsoft.com/office/word/2006/wordml" xmlns:wps="http://schemas.microsoft.com/office/word/2010/wordprocessingShape" mc:Ignorable="w14 w15 w16se w16cid w16 w16cex w16sdtdh w16sdtfl w16du wp14">
+<w:numbering xmlns:wpc="http://schemas.microsoft.com/office/word/2010/wordprocessingCanvas" xmlns:cx="http://schemas.microsoft.com/office/drawing/2014/chartex" xmlns:cx1="http://schemas.microsoft.com/office/drawing/2015/9/8/chartex" xmlns:cx2="http://schemas.microsoft.com/office/drawing/2015/10/21/chartex" xmlns:cx3="http://schemas.microsoft.com/office/drawing/2016/5/9/chartex" xmlns:cx4="http://schemas.microsoft.com/office/drawing/2016/5/10/chartex" xmlns:cx5="http://schemas.microsoft.com/office/drawing/2016/5/11/chartex" xmlns:cx6="http://schemas.microsoft.com/office/drawing/2016/5/12/chartex" xmlns:cx7="http://schemas.microsoft.com/office/drawing/2016/5/13/chartex" xmlns:cx8="http://schemas.microsoft.com/office/drawing/2016/5/14/chartex" xmlns:mc="http://schemas.openxmlformats.org/markup-compatibility/2006" xmlns:aink="http://schemas.microsoft.com/office/drawing/2016/ink" xmlns:am3d="http://schemas.microsoft.com/office/drawing/2017/model3d" xmlns:o="urn:schemas-microsoft-com:office:office" xmlns:oel="http://schemas.microsoft.com/office/2019/extlst" xmlns:r="http://schemas.openxmlformats.org/officeDocument/2006/relationships" xmlns:m="http://schemas.openxmlformats.org/officeDocument/2006/math" xmlns:v="urn:schemas-microsoft-com:vml" xmlns:wp14="http://schemas.microsoft.com/office/word/2010/wordprocessingDrawing" xmlns:wp="http://schemas.openxmlformats.org/drawingml/2006/wordprocessingDrawing" xmlns:w10="urn:schemas-microsoft-com:office:word" xmlns:w="http://schemas.openxmlformats.org/wordprocessingml/2006/main" xmlns:w14="http://schemas.microsoft.com/office/word/2010/wordml" xmlns:w15="http://schemas.microsoft.com/office/word/2012/wordml" xmlns:w16cex="http://schemas.microsoft.com/office/word/2018/wordml/cex" xmlns:w16cid="http://schemas.microsoft.com/office/word/2016/wordml/cid" xmlns:w16="http://schemas.microsoft.com/office/word/2018/wordml" xmlns:w16du="http://schemas.microsoft.com/office/word/2023/wordml/word16du" xmlns:w16sdtdh="http://schemas.microsoft.com/office/word/2020/wordml/sdtdatahash" xmlns:w16se="http://schemas.microsoft.com/office/word/2015/wordml/symex" xmlns:wpg="http://schemas.microsoft.com/office/word/2010/wordprocessingGroup" xmlns:wpi="http://schemas.microsoft.com/office/word/2010/wordprocessingInk" xmlns:wne="http://schemas.microsoft.com/office/word/2006/wordml" xmlns:wps="http://schemas.microsoft.com/office/word/2010/wordprocessingShape" mc:Ignorable="w14 w15 w16se w16cid w16 w16cex w16sdtdh w16du wp14">
   <w:abstractNum w:abstractNumId="0" w15:restartNumberingAfterBreak="0">
     <w:nsid w:val="0F85160F"/>
     <w:multiLevelType w:val="hybridMultilevel"/>
@@ -11069,7 +10851,7 @@
 </file>
 
 <file path=word/styles.xml><?xml version="1.0" encoding="utf-8"?>
-<w:styles xmlns:mc="http://schemas.openxmlformats.org/markup-compatibility/2006" xmlns:r="http://schemas.openxmlformats.org/officeDocument/2006/relationships" xmlns:w="http://schemas.openxmlformats.org/wordprocessingml/2006/main" xmlns:w14="http://schemas.microsoft.com/office/word/2010/wordml" xmlns:w15="http://schemas.microsoft.com/office/word/2012/wordml" xmlns:w16cex="http://schemas.microsoft.com/office/word/2018/wordml/cex" xmlns:w16cid="http://schemas.microsoft.com/office/word/2016/wordml/cid" xmlns:w16="http://schemas.microsoft.com/office/word/2018/wordml" xmlns:w16du="http://schemas.microsoft.com/office/word/2023/wordml/word16du" xmlns:w16sdtdh="http://schemas.microsoft.com/office/word/2020/wordml/sdtdatahash" xmlns:w16sdtfl="http://schemas.microsoft.com/office/word/2024/wordml/sdtformatlock" xmlns:w16se="http://schemas.microsoft.com/office/word/2015/wordml/symex" mc:Ignorable="w14 w15 w16se w16cid w16 w16cex w16sdtdh w16sdtfl w16du">
+<w:styles xmlns:mc="http://schemas.openxmlformats.org/markup-compatibility/2006" xmlns:r="http://schemas.openxmlformats.org/officeDocument/2006/relationships" xmlns:w="http://schemas.openxmlformats.org/wordprocessingml/2006/main" xmlns:w14="http://schemas.microsoft.com/office/word/2010/wordml" xmlns:w15="http://schemas.microsoft.com/office/word/2012/wordml" xmlns:w16cex="http://schemas.microsoft.com/office/word/2018/wordml/cex" xmlns:w16cid="http://schemas.microsoft.com/office/word/2016/wordml/cid" xmlns:w16="http://schemas.microsoft.com/office/word/2018/wordml" xmlns:w16du="http://schemas.microsoft.com/office/word/2023/wordml/word16du" xmlns:w16sdtdh="http://schemas.microsoft.com/office/word/2020/wordml/sdtdatahash" xmlns:w16se="http://schemas.microsoft.com/office/word/2015/wordml/symex" mc:Ignorable="w14 w15 w16se w16cid w16 w16cex w16sdtdh w16du">
   <w:docDefaults>
     <w:rPrDefault>
       <w:rPr>
@@ -11674,6 +11456,38 @@
       <w:szCs w:val="20"/>
     </w:rPr>
   </w:style>
+  <w:style w:type="paragraph" w:customStyle="1" w:styleId="font-claude-response-body">
+    <w:name w:val="font-claude-response-body"/>
+    <w:basedOn w:val="Normal"/>
+    <w:rsid w:val="00BB21EA"/>
+    <w:pPr>
+      <w:spacing w:before="100" w:beforeAutospacing="1" w:after="100" w:afterAutospacing="1"/>
+    </w:pPr>
+  </w:style>
+  <w:style w:type="character" w:styleId="Strong">
+    <w:name w:val="Strong"/>
+    <w:basedOn w:val="DefaultParagraphFont"/>
+    <w:uiPriority w:val="22"/>
+    <w:qFormat/>
+    <w:rsid w:val="00BB21EA"/>
+    <w:rPr>
+      <w:b/>
+      <w:bCs/>
+    </w:rPr>
+  </w:style>
+  <w:style w:type="character" w:styleId="HTMLCode">
+    <w:name w:val="HTML Code"/>
+    <w:basedOn w:val="DefaultParagraphFont"/>
+    <w:uiPriority w:val="99"/>
+    <w:semiHidden/>
+    <w:unhideWhenUsed/>
+    <w:rsid w:val="00C308C4"/>
+    <w:rPr>
+      <w:rFonts w:ascii="Courier New" w:eastAsia="Times New Roman" w:hAnsi="Courier New" w:cs="Courier New"/>
+      <w:sz w:val="20"/>
+      <w:szCs w:val="20"/>
+    </w:rPr>
+  </w:style>
 </w:styles>
 </file>
 

</xml_diff>

<commit_message>
Create jobs fỏ sprint 2
</commit_message>
<xml_diff>
--- a/docs/reports/MSE_Thesis_Proposal.docx
+++ b/docs/reports/MSE_Thesis_Proposal.docx
@@ -2138,7 +2138,13 @@
               <w:rPr>
                 <w:color w:val="000000"/>
               </w:rPr>
-              <w:t>Python, Parquet / SQLite</w:t>
+              <w:t xml:space="preserve">Python, Parquet / </w:t>
+            </w:r>
+            <w:r>
+              <w:rPr>
+                <w:color w:val="000000"/>
+              </w:rPr>
+              <w:t>DuckDB</w:t>
             </w:r>
           </w:p>
         </w:tc>
@@ -7891,7 +7897,13 @@
         <w:t>a minimum test failure rate of 1%</w:t>
       </w:r>
       <w:r>
-        <w:t xml:space="preserve"> across CI builds, verified against the loaded SQLite database (five projects qualify: </w:t>
+        <w:t xml:space="preserve"> across CI builds, verified against the loaded </w:t>
+      </w:r>
+      <w:r>
+        <w:t>DuckDB</w:t>
+      </w:r>
+      <w:r>
+        <w:t xml:space="preserve"> database (five projects qualify: </w:t>
       </w:r>
       <w:r>
         <w:rPr>
@@ -11501,6 +11513,7 @@
   <w:style w:type="character" w:default="1" w:styleId="DefaultParagraphFont">
     <w:name w:val="Default Paragraph Font"/>
     <w:uiPriority w:val="1"/>
+    <w:semiHidden/>
     <w:unhideWhenUsed/>
   </w:style>
   <w:style w:type="table" w:default="1" w:styleId="TableNormal">

</xml_diff>